<commit_message>
add link in document
</commit_message>
<xml_diff>
--- a/_mpi2026_group2_pw2_document.docx
+++ b/_mpi2026_group2_pw2_document.docx
@@ -410,15 +410,33 @@
       </w:r>
     </w:p>
     <w:p>
-      <w:pPr>
-        <w:rPr>
-          <w:rFonts w:ascii="Arial" w:hAnsi="Arial" w:cs="Arial"/>
-          <w:smallCaps/>
-          <w:spacing w:val="80"/>
-          <w:sz w:val="24"/>
-          <w:szCs w:val="24"/>
-        </w:rPr>
-      </w:pPr>
+      <w:proofErr w:type="spellStart"/>
+      <w:r>
+        <w:t>Link</w:t>
+      </w:r>
+      <w:proofErr w:type="spellEnd"/>
+      <w:r>
+        <w:t xml:space="preserve"> to </w:t>
+      </w:r>
+      <w:proofErr w:type="spellStart"/>
+      <w:r>
+        <w:t>repository</w:t>
+      </w:r>
+      <w:proofErr w:type="spellEnd"/>
+      <w:r>
+        <w:t xml:space="preserve">: </w:t>
+      </w:r>
+      <w:hyperlink r:id="rId7" w:history="1">
+        <w:r>
+          <w:rPr>
+            <w:rStyle w:val="Hyperlink"/>
+          </w:rPr>
+          <w:t>https://github.com/karluga/via-2026-android-pw2</w:t>
+        </w:r>
+      </w:hyperlink>
+      <w:r>
+        <w:t xml:space="preserve"> </w:t>
+      </w:r>
     </w:p>
     <w:p>
       <w:pPr>
@@ -1484,21 +1502,7 @@
         <w:rPr>
           <w:lang w:val="lv-LV"/>
         </w:rPr>
-        <w:t xml:space="preserve">: </w:t>
-      </w:r>
-      <w:proofErr w:type="spellStart"/>
-      <w:r>
-        <w:rPr>
-          <w:lang w:val="lv-LV"/>
-        </w:rPr>
-        <w:t>Full</w:t>
-      </w:r>
-      <w:proofErr w:type="spellEnd"/>
-      <w:r>
-        <w:rPr>
-          <w:lang w:val="lv-LV"/>
-        </w:rPr>
-        <w:t xml:space="preserve"> </w:t>
+        <w:t xml:space="preserve">: Full </w:t>
       </w:r>
       <w:proofErr w:type="spellStart"/>
       <w:r>
@@ -4034,13 +4038,8 @@
         <w:ind w:right="-81"/>
       </w:pPr>
       <w:bookmarkStart w:id="5" w:name="_Toc241610352"/>
-      <w:proofErr w:type="spellStart"/>
-      <w:r>
-        <w:t>State</w:t>
-      </w:r>
-      <w:proofErr w:type="spellEnd"/>
-      <w:r>
-        <w:t xml:space="preserve"> Management &amp; Interactive Elements</w:t>
+      <w:r>
+        <w:t>State Management &amp; Interactive Elements</w:t>
       </w:r>
       <w:bookmarkEnd w:id="5"/>
     </w:p>
@@ -4616,21 +4615,8 @@
         <w:pStyle w:val="aaaa"/>
       </w:pPr>
       <w:bookmarkStart w:id="6" w:name="_Toc241610353"/>
-      <w:proofErr w:type="spellStart"/>
-      <w:r>
-        <w:t>Split-Screen</w:t>
-      </w:r>
-      <w:proofErr w:type="spellEnd"/>
-      <w:r>
-        <w:t xml:space="preserve"> </w:t>
-      </w:r>
-      <w:proofErr w:type="spellStart"/>
-      <w:r>
-        <w:t>Tooling</w:t>
-      </w:r>
-      <w:proofErr w:type="spellEnd"/>
-      <w:r>
-        <w:t xml:space="preserve"> (@Preview)</w:t>
+      <w:r>
+        <w:t>Split-Screen Tooling (@Preview)</w:t>
       </w:r>
       <w:bookmarkEnd w:id="6"/>
     </w:p>
@@ -4920,11 +4906,11 @@
       </w:r>
       <w:proofErr w:type="spellEnd"/>
       <w:r>
-        <w:t xml:space="preserve"> i</w:t>
-      </w:r>
-      <w:proofErr w:type="spellStart"/>
-      <w:r>
-        <w:t>s</w:t>
+        <w:t xml:space="preserve"> </w:t>
+      </w:r>
+      <w:proofErr w:type="spellStart"/>
+      <w:r>
+        <w:t>is</w:t>
       </w:r>
       <w:proofErr w:type="spellEnd"/>
       <w:r>
@@ -5544,10 +5530,7 @@
       </w:r>
       <w:proofErr w:type="spellEnd"/>
       <w:r>
-        <w:t xml:space="preserve"> Manifest</w:t>
-      </w:r>
-      <w:r>
-        <w:t>?</w:t>
+        <w:t xml:space="preserve"> Manifest?</w:t>
       </w:r>
     </w:p>
     <w:p>
@@ -6005,15 +5988,7 @@
       </w:r>
       <w:proofErr w:type="spellEnd"/>
       <w:r>
-        <w:t xml:space="preserve"> (Backward </w:t>
-      </w:r>
-      <w:proofErr w:type="spellStart"/>
-      <w:r>
-        <w:t>Navigation</w:t>
-      </w:r>
-      <w:proofErr w:type="spellEnd"/>
-      <w:r>
-        <w:t>)</w:t>
+        <w:t xml:space="preserve"> (Backward Navigation)</w:t>
       </w:r>
       <w:bookmarkEnd w:id="9"/>
     </w:p>
@@ -7514,14 +7489,14 @@
         <w:rPr>
           <w:lang w:eastAsia="fi-FI"/>
         </w:rPr>
-        <w:t>: Destro</w:t>
-      </w:r>
-      <w:proofErr w:type="spellStart"/>
-      <w:r>
-        <w:rPr>
-          <w:lang w:eastAsia="fi-FI"/>
-        </w:rPr>
-        <w:t>ying</w:t>
+        <w:t xml:space="preserve">: </w:t>
+      </w:r>
+      <w:proofErr w:type="spellStart"/>
+      <w:r>
+        <w:rPr>
+          <w:lang w:eastAsia="fi-FI"/>
+        </w:rPr>
+        <w:t>Destroying</w:t>
       </w:r>
       <w:proofErr w:type="spellEnd"/>
       <w:r>
@@ -8718,13 +8693,7 @@
         <w:rPr>
           <w:lang w:eastAsia="fi-FI"/>
         </w:rPr>
-        <w:t>:</w:t>
-      </w:r>
-      <w:r>
-        <w:rPr>
-          <w:lang w:eastAsia="fi-FI"/>
-        </w:rPr>
-        <w:t xml:space="preserve"> </w:t>
+        <w:t xml:space="preserve">: </w:t>
       </w:r>
     </w:p>
     <w:p>
@@ -9658,6 +9627,7 @@
       </w:pPr>
       <w:r>
         <w:rPr>
+          <w:noProof/>
           <w:lang w:val="en-US" w:eastAsia="fi-FI"/>
         </w:rPr>
         <w:drawing>
@@ -9676,7 +9646,7 @@
                     <pic:cNvPicPr/>
                   </pic:nvPicPr>
                   <pic:blipFill>
-                    <a:blip r:embed="rId7"/>
+                    <a:blip r:embed="rId8"/>
                     <a:stretch>
                       <a:fillRect/>
                     </a:stretch>
@@ -9727,7 +9697,7 @@
                     <pic:cNvPicPr/>
                   </pic:nvPicPr>
                   <pic:blipFill rotWithShape="1">
-                    <a:blip r:embed="rId8"/>
+                    <a:blip r:embed="rId9"/>
                     <a:srcRect t="9015" b="2382"/>
                     <a:stretch>
                       <a:fillRect/>
@@ -9784,7 +9754,7 @@
                     <pic:cNvPicPr/>
                   </pic:nvPicPr>
                   <pic:blipFill>
-                    <a:blip r:embed="rId9"/>
+                    <a:blip r:embed="rId10"/>
                     <a:stretch>
                       <a:fillRect/>
                     </a:stretch>
@@ -9818,6 +9788,7 @@
       </w:pPr>
       <w:r>
         <w:rPr>
+          <w:noProof/>
           <w:lang w:val="en-US" w:eastAsia="fi-FI"/>
         </w:rPr>
         <w:drawing>
@@ -9836,7 +9807,7 @@
                     <pic:cNvPicPr/>
                   </pic:nvPicPr>
                   <pic:blipFill>
-                    <a:blip r:embed="rId10"/>
+                    <a:blip r:embed="rId11"/>
                     <a:stretch>
                       <a:fillRect/>
                     </a:stretch>
@@ -9864,6 +9835,7 @@
       </w:r>
       <w:r>
         <w:rPr>
+          <w:noProof/>
           <w:lang w:val="en-US" w:eastAsia="fi-FI"/>
         </w:rPr>
         <w:drawing>
@@ -9882,7 +9854,7 @@
                     <pic:cNvPicPr/>
                   </pic:nvPicPr>
                   <pic:blipFill>
-                    <a:blip r:embed="rId11"/>
+                    <a:blip r:embed="rId12"/>
                     <a:stretch>
                       <a:fillRect/>
                     </a:stretch>
@@ -9904,12 +9876,12 @@
       </w:r>
     </w:p>
     <w:sectPr>
-      <w:headerReference w:type="even" r:id="rId12"/>
-      <w:headerReference w:type="default" r:id="rId13"/>
-      <w:footerReference w:type="even" r:id="rId14"/>
-      <w:footerReference w:type="default" r:id="rId15"/>
-      <w:headerReference w:type="first" r:id="rId16"/>
-      <w:footerReference w:type="first" r:id="rId17"/>
+      <w:headerReference w:type="even" r:id="rId13"/>
+      <w:headerReference w:type="default" r:id="rId14"/>
+      <w:footerReference w:type="even" r:id="rId15"/>
+      <w:footerReference w:type="default" r:id="rId16"/>
+      <w:headerReference w:type="first" r:id="rId17"/>
+      <w:footerReference w:type="first" r:id="rId18"/>
       <w:pgSz w:w="11906" w:h="16838"/>
       <w:pgMar w:top="1132" w:right="849" w:bottom="1135" w:left="1418" w:header="426" w:footer="419" w:gutter="0"/>
       <w:cols w:space="720"/>
@@ -11990,6 +11962,7 @@
   <w:style w:type="character" w:default="1" w:styleId="DefaultParagraphFont">
     <w:name w:val="Default Paragraph Font"/>
     <w:uiPriority w:val="1"/>
+    <w:semiHidden/>
     <w:unhideWhenUsed/>
   </w:style>
   <w:style w:type="table" w:default="1" w:styleId="TableNormal">
@@ -12601,6 +12574,18 @@
       <w:lang w:val="en-US" w:eastAsia="fi-FI"/>
     </w:rPr>
   </w:style>
+  <w:style w:type="character" w:styleId="UnresolvedMention">
+    <w:name w:val="Unresolved Mention"/>
+    <w:basedOn w:val="DefaultParagraphFont"/>
+    <w:uiPriority w:val="99"/>
+    <w:semiHidden/>
+    <w:unhideWhenUsed/>
+    <w:rsid w:val="0008367B"/>
+    <w:rPr>
+      <w:color w:val="605E5C"/>
+      <w:shd w:val="clear" w:color="auto" w:fill="E1DFDD"/>
+    </w:rPr>
+  </w:style>
 </w:styles>
 </file>
 

</xml_diff>